<commit_message>
Portal: as concorrências na conta de verdade (fatia 7), em inglês e português
Co-Authored-By: Claude Fable 5.1 <noreply@anthropic.com>
Claude-Session: https://claude.ai/code/session_01Ep8bJsuQq2bqGePCMzzux2
</commit_message>
<xml_diff>
--- a/portal/files/KORbuild - How KORbuild is organized.docx
+++ b/portal/files/KORbuild - How KORbuild is organized.docx
@@ -1361,19 +1361,6 @@
           <w:b w:val="0"/>
           <w:i w:val="0"/>
         </w:rPr>
-        <w:t>How a general contractor invites a subcontractor and how the jobs get linked (today they come linked in the sample data). This comes with the bidding feature and the database.</w:t>
-      </w:r>
-    </w:p>
-    <w:p>
-      <w:pPr>
-        <w:pStyle w:val="ListBullet"/>
-        <w:shd w:val="clear" w:color="auto" w:fill="FEF3F2"/>
-      </w:pPr>
-      <w:r>
-        <w:rPr>
-          <w:b w:val="0"/>
-          <w:i w:val="0"/>
-        </w:rPr>
         <w:t>Whether a subcontractor can choose to share less (for example, hours without names).</w:t>
       </w:r>
     </w:p>

</xml_diff>